<commit_message>
add rep for lab01
</commit_message>
<xml_diff>
--- a/labs/lab01/report/ЛР1_Машков_отчёт.docx
+++ b/labs/lab01/report/ЛР1_Машков_отчёт.docx
@@ -160,7 +160,7 @@
         </w:numPr>
       </w:pPr>
       <w:r>
-        <w:t xml:space="preserve">Добавить график функции y = cos x + 1/3 * cos 3x + 1/5 * cos 5x на интервале [-10; 10]. График экспортировать .</w:t>
+        <w:t xml:space="preserve">Добавить график функции y = cos x + 1/3 * cos 3x + 1/5 * cos 5x на интервале [-10; 10]. График экспортировать.</w:t>
       </w:r>
     </w:p>
     <w:p>
@@ -172,7 +172,7 @@
         </w:numPr>
       </w:pPr>
       <w:r>
-        <w:t xml:space="preserve">Разложение импульсного сигнала в частичный ряд Фурье: Разработать код m-файла, результатом выполнения которого являются графики меандра (рис. 1.3), реализованные с различным количеством гармоник.</w:t>
+        <w:t xml:space="preserve">Разложение импульсного сигнала в частичный ряд Фурье: Разработать код m-файла, результатом выполнения которого являются графики меандра, реализованные с различным количеством гармоник.</w:t>
       </w:r>
     </w:p>
     <w:p>
@@ -226,11 +226,11 @@
         </w:numPr>
       </w:pPr>
       <w:r>
-        <w:t xml:space="preserve">Амплитудная модуляция: Продемонстрировать принципы модуляции сигнала на примере аналоговой амплитудной модуляции (рис.1.9).</w:t>
+        <w:t xml:space="preserve">Амплитудная модуляция: Продемонстрировать принципы модуляции сигнала на примере аналоговой амплитудной модуляции.</w:t>
       </w:r>
     </w:p>
     <w:bookmarkEnd w:id="21"/>
-    <w:bookmarkStart w:id="113" w:name="выполнение-лабораторной-работы"/>
+    <w:bookmarkStart w:id="114" w:name="выполнение-лабораторной-работы"/>
     <w:p>
       <w:pPr>
         <w:pStyle w:val="Heading1"/>
@@ -1191,7 +1191,7 @@
           <wp:inline>
             <wp:extent cx="3733800" cy="2795627"/>
             <wp:effectExtent b="0" l="0" r="0" t="0"/>
-            <wp:docPr descr="График функций 𝑦1 и 𝑦2 на интервале от−10 до 10 включая концы`" title="fig:" id="26" name="Picture"/>
+            <wp:docPr descr="График функций y1 и y2 на интервале от−10 до 10 включая концы`" title="fig:" id="26" name="Picture"/>
             <a:graphic>
               <a:graphicData uri="http://schemas.openxmlformats.org/drawingml/2006/picture">
                 <pic:pic>
@@ -1234,7 +1234,7 @@
         <w:pStyle w:val="ImageCaption"/>
       </w:pPr>
       <w:r>
-        <w:t xml:space="preserve">График функций 𝑦1 и 𝑦2 на интервале от−10 до 10 включая концы`</w:t>
+        <w:t xml:space="preserve">График функций y1 и y2 на интервале от−10 до 10 включая концы`</w:t>
       </w:r>
     </w:p>
     <w:bookmarkEnd w:id="28"/>
@@ -2708,16 +2708,7 @@
         <w:rPr>
           <w:rStyle w:val="VerbatimChar"/>
         </w:rPr>
-        <w:t xml:space="preserve">% Создание каталогов signal и spectre для размещения</w:t>
-      </w:r>
-      <w:r>
-        <w:br/>
-      </w:r>
-      <w:r>
-        <w:rPr>
-          <w:rStyle w:val="VerbatimChar"/>
-        </w:rPr>
-        <w:t xml:space="preserve">↪ графиков:</w:t>
+        <w:t xml:space="preserve">% Создание каталогов signal и spectre для размещения графиков:</w:t>
       </w:r>
       <w:r>
         <w:br/>
@@ -3715,7 +3706,7 @@
       </w:r>
     </w:p>
     <w:bookmarkEnd w:id="58"/>
-    <w:bookmarkStart w:id="112" w:name="Xd3d5453b5762a1b1c0f0f300c80832d13c9bffc"/>
+    <w:bookmarkStart w:id="113" w:name="Xd3d5453b5762a1b1c0f0f300c80832d13c9bffc"/>
     <w:p>
       <w:pPr>
         <w:pStyle w:val="Heading2"/>
@@ -5639,75 +5630,20 @@
       <w:r>
         <w:drawing>
           <wp:inline>
-            <wp:extent cx="5334000" cy="4000500"/>
+            <wp:extent cx="5334000" cy="3993753"/>
             <wp:effectExtent b="0" l="0" r="0" t="0"/>
-            <wp:docPr descr="Униполярное кодирование: нет самосинхронизации" title="fig:" id="77" name="Picture"/>
+            <wp:docPr descr="Кодирование AMI: самосинхронизация при наличии сигнала" title="fig:" id="78" name="Picture"/>
             <a:graphic>
               <a:graphicData uri="http://schemas.openxmlformats.org/drawingml/2006/picture">
                 <pic:pic>
                   <pic:nvPicPr>
-                    <pic:cNvPr descr="image/17.png" id="78" name="Picture"/>
+                    <pic:cNvPr descr="image/18.png" id="79" name="Picture"/>
                     <pic:cNvPicPr>
                       <a:picLocks noChangeArrowheads="1" noChangeAspect="1"/>
                     </pic:cNvPicPr>
                   </pic:nvPicPr>
                   <pic:blipFill>
-                    <a:blip r:embed="rId59"/>
-                    <a:stretch>
-                      <a:fillRect/>
-                    </a:stretch>
-                  </pic:blipFill>
-                  <pic:spPr bwMode="auto">
-                    <a:xfrm>
-                      <a:off x="0" y="0"/>
-                      <a:ext cx="5334000" cy="4000500"/>
-                    </a:xfrm>
-                    <a:prstGeom prst="rect">
-                      <a:avLst/>
-                    </a:prstGeom>
-                    <a:noFill/>
-                    <a:ln w="9525">
-                      <a:noFill/>
-                      <a:headEnd/>
-                      <a:tailEnd/>
-                    </a:ln>
-                  </pic:spPr>
-                </pic:pic>
-              </a:graphicData>
-            </a:graphic>
-          </wp:inline>
-        </w:drawing>
-      </w:r>
-    </w:p>
-    <w:p>
-      <w:pPr>
-        <w:pStyle w:val="ImageCaption"/>
-      </w:pPr>
-      <w:r>
-        <w:t xml:space="preserve">Униполярное кодирование: нет самосинхронизации</w:t>
-      </w:r>
-    </w:p>
-    <w:p>
-      <w:pPr>
-        <w:pStyle w:val="CaptionedFigure"/>
-      </w:pPr>
-      <w:r>
-        <w:drawing>
-          <wp:inline>
-            <wp:extent cx="5334000" cy="3993753"/>
-            <wp:effectExtent b="0" l="0" r="0" t="0"/>
-            <wp:docPr descr="Кодирование AMI: самосинхронизация при наличии сигнала" title="fig:" id="80" name="Picture"/>
-            <a:graphic>
-              <a:graphicData uri="http://schemas.openxmlformats.org/drawingml/2006/picture">
-                <pic:pic>
-                  <pic:nvPicPr>
-                    <pic:cNvPr descr="image/18.png" id="81" name="Picture"/>
-                    <pic:cNvPicPr>
-                      <a:picLocks noChangeArrowheads="1" noChangeAspect="1"/>
-                    </pic:cNvPicPr>
-                  </pic:nvPicPr>
-                  <pic:blipFill>
-                    <a:blip r:embed="rId79"/>
+                    <a:blip r:embed="rId77"/>
                     <a:stretch>
                       <a:fillRect/>
                     </a:stretch>
@@ -5751,18 +5687,18 @@
           <wp:inline>
             <wp:extent cx="5334000" cy="3993753"/>
             <wp:effectExtent b="0" l="0" r="0" t="0"/>
-            <wp:docPr descr="Кодирование NRZ: нет самосинхронизации" title="fig:" id="83" name="Picture"/>
+            <wp:docPr descr="Кодирование NRZ: нет самосинхронизации" title="fig:" id="81" name="Picture"/>
             <a:graphic>
               <a:graphicData uri="http://schemas.openxmlformats.org/drawingml/2006/picture">
                 <pic:pic>
                   <pic:nvPicPr>
-                    <pic:cNvPr descr="image/19.png" id="84" name="Picture"/>
+                    <pic:cNvPr descr="image/19.png" id="82" name="Picture"/>
                     <pic:cNvPicPr>
                       <a:picLocks noChangeArrowheads="1" noChangeAspect="1"/>
                     </pic:cNvPicPr>
                   </pic:nvPicPr>
                   <pic:blipFill>
-                    <a:blip r:embed="rId82"/>
+                    <a:blip r:embed="rId80"/>
                     <a:stretch>
                       <a:fillRect/>
                     </a:stretch>
@@ -5806,18 +5742,18 @@
           <wp:inline>
             <wp:extent cx="5334000" cy="3993753"/>
             <wp:effectExtent b="0" l="0" r="0" t="0"/>
-            <wp:docPr descr="Кодирование RZ: есть самосинхронизация" title="fig:" id="86" name="Picture"/>
+            <wp:docPr descr="Униполярное кодирование: нет самосинхронизации" title="fig:" id="84" name="Picture"/>
             <a:graphic>
               <a:graphicData uri="http://schemas.openxmlformats.org/drawingml/2006/picture">
                 <pic:pic>
                   <pic:nvPicPr>
-                    <pic:cNvPr descr="image/20.png" id="87" name="Picture"/>
+                    <pic:cNvPr descr="image/23.png" id="85" name="Picture"/>
                     <pic:cNvPicPr>
                       <a:picLocks noChangeArrowheads="1" noChangeAspect="1"/>
                     </pic:cNvPicPr>
                   </pic:nvPicPr>
                   <pic:blipFill>
-                    <a:blip r:embed="rId85"/>
+                    <a:blip r:embed="rId83"/>
                     <a:stretch>
                       <a:fillRect/>
                     </a:stretch>
@@ -5849,7 +5785,7 @@
         <w:pStyle w:val="ImageCaption"/>
       </w:pPr>
       <w:r>
-        <w:t xml:space="preserve">Кодирование RZ: есть самосинхронизация</w:t>
+        <w:t xml:space="preserve">Униполярное кодирование: нет самосинхронизации</w:t>
       </w:r>
     </w:p>
     <w:p>
@@ -5861,18 +5797,18 @@
           <wp:inline>
             <wp:extent cx="5334000" cy="3993753"/>
             <wp:effectExtent b="0" l="0" r="0" t="0"/>
-            <wp:docPr descr="Манчестерское кодирование: есть самосинхронизация" title="fig:" id="89" name="Picture"/>
+            <wp:docPr descr="Кодирование RZ: есть самосинхронизация" title="fig:" id="87" name="Picture"/>
             <a:graphic>
               <a:graphicData uri="http://schemas.openxmlformats.org/drawingml/2006/picture">
                 <pic:pic>
                   <pic:nvPicPr>
-                    <pic:cNvPr descr="image/22.png" id="90" name="Picture"/>
+                    <pic:cNvPr descr="image/20.png" id="88" name="Picture"/>
                     <pic:cNvPicPr>
                       <a:picLocks noChangeArrowheads="1" noChangeAspect="1"/>
                     </pic:cNvPicPr>
                   </pic:nvPicPr>
                   <pic:blipFill>
-                    <a:blip r:embed="rId88"/>
+                    <a:blip r:embed="rId86"/>
                     <a:stretch>
                       <a:fillRect/>
                     </a:stretch>
@@ -5904,7 +5840,7 @@
         <w:pStyle w:val="ImageCaption"/>
       </w:pPr>
       <w:r>
-        <w:t xml:space="preserve">Манчестерское кодирование: есть самосинхронизация</w:t>
+        <w:t xml:space="preserve">Кодирование RZ: есть самосинхронизация</w:t>
       </w:r>
     </w:p>
     <w:p>
@@ -5914,20 +5850,75 @@
       <w:r>
         <w:drawing>
           <wp:inline>
-            <wp:extent cx="3733800" cy="2795627"/>
+            <wp:extent cx="5334000" cy="3993753"/>
             <wp:effectExtent b="0" l="0" r="0" t="0"/>
-            <wp:docPr descr="Дифференциальное манчестерское кодирование: есть самосинхронизация" title="fig:" id="92" name="Picture"/>
+            <wp:docPr descr="Манчестерское кодирование: есть самосинхронизация" title="fig:" id="90" name="Picture"/>
             <a:graphic>
               <a:graphicData uri="http://schemas.openxmlformats.org/drawingml/2006/picture">
                 <pic:pic>
                   <pic:nvPicPr>
-                    <pic:cNvPr descr="image/21.png" id="93" name="Picture"/>
+                    <pic:cNvPr descr="image/22.png" id="91" name="Picture"/>
                     <pic:cNvPicPr>
                       <a:picLocks noChangeArrowheads="1" noChangeAspect="1"/>
                     </pic:cNvPicPr>
                   </pic:nvPicPr>
                   <pic:blipFill>
-                    <a:blip r:embed="rId91"/>
+                    <a:blip r:embed="rId89"/>
+                    <a:stretch>
+                      <a:fillRect/>
+                    </a:stretch>
+                  </pic:blipFill>
+                  <pic:spPr bwMode="auto">
+                    <a:xfrm>
+                      <a:off x="0" y="0"/>
+                      <a:ext cx="5334000" cy="3993753"/>
+                    </a:xfrm>
+                    <a:prstGeom prst="rect">
+                      <a:avLst/>
+                    </a:prstGeom>
+                    <a:noFill/>
+                    <a:ln w="9525">
+                      <a:noFill/>
+                      <a:headEnd/>
+                      <a:tailEnd/>
+                    </a:ln>
+                  </pic:spPr>
+                </pic:pic>
+              </a:graphicData>
+            </a:graphic>
+          </wp:inline>
+        </w:drawing>
+      </w:r>
+    </w:p>
+    <w:p>
+      <w:pPr>
+        <w:pStyle w:val="ImageCaption"/>
+      </w:pPr>
+      <w:r>
+        <w:t xml:space="preserve">Манчестерское кодирование: есть самосинхронизация</w:t>
+      </w:r>
+    </w:p>
+    <w:p>
+      <w:pPr>
+        <w:pStyle w:val="CaptionedFigure"/>
+      </w:pPr>
+      <w:r>
+        <w:drawing>
+          <wp:inline>
+            <wp:extent cx="3733800" cy="2795627"/>
+            <wp:effectExtent b="0" l="0" r="0" t="0"/>
+            <wp:docPr descr="Дифференциальное манчестерское кодирование: есть самосинхронизация" title="fig:" id="93" name="Picture"/>
+            <a:graphic>
+              <a:graphicData uri="http://schemas.openxmlformats.org/drawingml/2006/picture">
+                <pic:pic>
+                  <pic:nvPicPr>
+                    <pic:cNvPr descr="image/21.png" id="94" name="Picture"/>
+                    <pic:cNvPicPr>
+                      <a:picLocks noChangeArrowheads="1" noChangeAspect="1"/>
+                    </pic:cNvPicPr>
+                  </pic:nvPicPr>
+                  <pic:blipFill>
+                    <a:blip r:embed="rId92"/>
                     <a:stretch>
                       <a:fillRect/>
                     </a:stretch>
@@ -5971,18 +5962,18 @@
           <wp:inline>
             <wp:extent cx="5334000" cy="3993753"/>
             <wp:effectExtent b="0" l="0" r="0" t="0"/>
-            <wp:docPr descr="Униполярное кодирование: спектр сигнала" title="fig:" id="95" name="Picture"/>
+            <wp:docPr descr="Униполярное кодирование: спектр сигнала" title="fig:" id="96" name="Picture"/>
             <a:graphic>
               <a:graphicData uri="http://schemas.openxmlformats.org/drawingml/2006/picture">
                 <pic:pic>
                   <pic:nvPicPr>
-                    <pic:cNvPr descr="image/29.png" id="96" name="Picture"/>
+                    <pic:cNvPr descr="image/29.png" id="97" name="Picture"/>
                     <pic:cNvPicPr>
                       <a:picLocks noChangeArrowheads="1" noChangeAspect="1"/>
                     </pic:cNvPicPr>
                   </pic:nvPicPr>
                   <pic:blipFill>
-                    <a:blip r:embed="rId94"/>
+                    <a:blip r:embed="rId95"/>
                     <a:stretch>
                       <a:fillRect/>
                     </a:stretch>
@@ -6026,18 +6017,18 @@
           <wp:inline>
             <wp:extent cx="5334000" cy="3993753"/>
             <wp:effectExtent b="0" l="0" r="0" t="0"/>
-            <wp:docPr descr="Кодирование AMI: спектр сигнала" title="fig:" id="98" name="Picture"/>
+            <wp:docPr descr="Кодирование AMI: спектр сигнала" title="fig:" id="99" name="Picture"/>
             <a:graphic>
               <a:graphicData uri="http://schemas.openxmlformats.org/drawingml/2006/picture">
                 <pic:pic>
                   <pic:nvPicPr>
-                    <pic:cNvPr descr="image/24.png" id="99" name="Picture"/>
+                    <pic:cNvPr descr="image/24.png" id="100" name="Picture"/>
                     <pic:cNvPicPr>
                       <a:picLocks noChangeArrowheads="1" noChangeAspect="1"/>
                     </pic:cNvPicPr>
                   </pic:nvPicPr>
                   <pic:blipFill>
-                    <a:blip r:embed="rId97"/>
+                    <a:blip r:embed="rId98"/>
                     <a:stretch>
                       <a:fillRect/>
                     </a:stretch>
@@ -6081,18 +6072,18 @@
           <wp:inline>
             <wp:extent cx="5334000" cy="3993753"/>
             <wp:effectExtent b="0" l="0" r="0" t="0"/>
-            <wp:docPr descr="Кодирование NRZ: спектр сигнала" title="fig:" id="101" name="Picture"/>
+            <wp:docPr descr="Кодирование NRZ: спектр сигнала" title="fig:" id="102" name="Picture"/>
             <a:graphic>
               <a:graphicData uri="http://schemas.openxmlformats.org/drawingml/2006/picture">
                 <pic:pic>
                   <pic:nvPicPr>
-                    <pic:cNvPr descr="image/25.png" id="102" name="Picture"/>
+                    <pic:cNvPr descr="image/25.png" id="103" name="Picture"/>
                     <pic:cNvPicPr>
                       <a:picLocks noChangeArrowheads="1" noChangeAspect="1"/>
                     </pic:cNvPicPr>
                   </pic:nvPicPr>
                   <pic:blipFill>
-                    <a:blip r:embed="rId100"/>
+                    <a:blip r:embed="rId101"/>
                     <a:stretch>
                       <a:fillRect/>
                     </a:stretch>
@@ -6136,18 +6127,18 @@
           <wp:inline>
             <wp:extent cx="5334000" cy="3993753"/>
             <wp:effectExtent b="0" l="0" r="0" t="0"/>
-            <wp:docPr descr="Кодирование RZ: спектр сигнала" title="fig:" id="104" name="Picture"/>
+            <wp:docPr descr="Кодирование RZ: спектр сигнала" title="fig:" id="105" name="Picture"/>
             <a:graphic>
               <a:graphicData uri="http://schemas.openxmlformats.org/drawingml/2006/picture">
                 <pic:pic>
                   <pic:nvPicPr>
-                    <pic:cNvPr descr="image/26.png" id="105" name="Picture"/>
+                    <pic:cNvPr descr="image/26.png" id="106" name="Picture"/>
                     <pic:cNvPicPr>
                       <a:picLocks noChangeArrowheads="1" noChangeAspect="1"/>
                     </pic:cNvPicPr>
                   </pic:nvPicPr>
                   <pic:blipFill>
-                    <a:blip r:embed="rId103"/>
+                    <a:blip r:embed="rId104"/>
                     <a:stretch>
                       <a:fillRect/>
                     </a:stretch>
@@ -6191,18 +6182,18 @@
           <wp:inline>
             <wp:extent cx="5334000" cy="3993753"/>
             <wp:effectExtent b="0" l="0" r="0" t="0"/>
-            <wp:docPr descr="Манчестерское кодирование: спектр сигнала" title="fig:" id="107" name="Picture"/>
+            <wp:docPr descr="Манчестерское кодирование: спектр сигнала" title="fig:" id="108" name="Picture"/>
             <a:graphic>
               <a:graphicData uri="http://schemas.openxmlformats.org/drawingml/2006/picture">
                 <pic:pic>
                   <pic:nvPicPr>
-                    <pic:cNvPr descr="image/28.png" id="108" name="Picture"/>
+                    <pic:cNvPr descr="image/28.png" id="109" name="Picture"/>
                     <pic:cNvPicPr>
                       <a:picLocks noChangeArrowheads="1" noChangeAspect="1"/>
                     </pic:cNvPicPr>
                   </pic:nvPicPr>
                   <pic:blipFill>
-                    <a:blip r:embed="rId106"/>
+                    <a:blip r:embed="rId107"/>
                     <a:stretch>
                       <a:fillRect/>
                     </a:stretch>
@@ -6246,18 +6237,18 @@
           <wp:inline>
             <wp:extent cx="5334000" cy="3993753"/>
             <wp:effectExtent b="0" l="0" r="0" t="0"/>
-            <wp:docPr descr="Дифференциальное манчестерское кодирование: спектр сигнала" title="fig:" id="110" name="Picture"/>
+            <wp:docPr descr="Дифференциальное манчестерское кодирование: спектр сигнала" title="fig:" id="111" name="Picture"/>
             <a:graphic>
               <a:graphicData uri="http://schemas.openxmlformats.org/drawingml/2006/picture">
                 <pic:pic>
                   <pic:nvPicPr>
-                    <pic:cNvPr descr="image/27.png" id="111" name="Picture"/>
+                    <pic:cNvPr descr="image/27.png" id="112" name="Picture"/>
                     <pic:cNvPicPr>
                       <a:picLocks noChangeArrowheads="1" noChangeAspect="1"/>
                     </pic:cNvPicPr>
                   </pic:nvPicPr>
                   <pic:blipFill>
-                    <a:blip r:embed="rId109"/>
+                    <a:blip r:embed="rId110"/>
                     <a:stretch>
                       <a:fillRect/>
                     </a:stretch>
@@ -6292,9 +6283,9 @@
         <w:t xml:space="preserve">Дифференциальное манчестерское кодирование: спектр сигнала</w:t>
       </w:r>
     </w:p>
-    <w:bookmarkEnd w:id="112"/>
     <w:bookmarkEnd w:id="113"/>
-    <w:bookmarkStart w:id="114" w:name="выводы"/>
+    <w:bookmarkEnd w:id="114"/>
+    <w:bookmarkStart w:id="115" w:name="выводы"/>
     <w:p>
       <w:pPr>
         <w:pStyle w:val="Heading1"/>
@@ -6320,8 +6311,8 @@
         <w:t xml:space="preserve">В ходе данной лабораторной работы я изучил методы кодирования и модуляции сигналов с помощью высокоуровнего языка программирования Octave. Научился определять спектра и параметров сигнала. Были продемонстрированы принципы модуляции сигнала на примере аналоговой амплитудной модуляции. Так же были исследованы свойства самосинхронизации сигнала.</w:t>
       </w:r>
     </w:p>
-    <w:bookmarkEnd w:id="114"/>
-    <w:bookmarkStart w:id="116" w:name="список-литературы"/>
+    <w:bookmarkEnd w:id="115"/>
+    <w:bookmarkStart w:id="117" w:name="список-литературы"/>
     <w:p>
       <w:pPr>
         <w:pStyle w:val="Heading1"/>
@@ -6334,7 +6325,7 @@
       <w:pPr>
         <w:pStyle w:val="FirstParagraph"/>
       </w:pPr>
-      <w:hyperlink r:id="rId115">
+      <w:hyperlink r:id="rId116">
         <w:r>
           <w:rPr>
             <w:rStyle w:val="Hyperlink"/>
@@ -6343,7 +6334,7 @@
         </w:r>
       </w:hyperlink>
     </w:p>
-    <w:bookmarkEnd w:id="116"/>
+    <w:bookmarkEnd w:id="117"/>
     <w:sectPr/>
   </w:body>
 </w:document>

</xml_diff>